<commit_message>
docs(v1.8.0): publish final production release evidence and artefacts
Record migration 0044 verification, the final production release report (PDF/DOCX), and Documentation Centre sync after merge of the market-readiness closure.
</commit_message>
<xml_diff>
--- a/apps/frontend/public/documentation/docx/BUSINESS_REQUIREMENTS_BOOK.docx
+++ b/apps/frontend/public/documentation/docx/BUSINESS_REQUIREMENTS_BOOK.docx
@@ -42,7 +42,7 @@
           <w:sz w:val="24"/>
           <w:szCs w:val="24"/>
         </w:rPr>
-        <w:t xml:space="preserve">Business Requirements Book — v1.7.3</w:t>
+        <w:t xml:space="preserve">Business Requirements Book — v1.8.0</w:t>
       </w:r>
     </w:p>
     <w:p>
@@ -318,7 +318,7 @@
           <w:sz w:val="22"/>
           <w:szCs w:val="22"/>
         </w:rPr>
-        <w:t xml:space="preserve">| BR-014 | Pool hard-stop on insufficient capital | Complete | Cannot over-disburse |</w:t>
+        <w:t xml:space="preserve">| BR-014 | Pool hard-stop on insufficient capital | Complete | Create + disburse validation (v1.8.0 Phase 11) |</w:t>
       </w:r>
     </w:p>
     <w:p>
@@ -343,6 +343,18 @@
           <w:szCs w:val="22"/>
         </w:rPr>
         <w:t xml:space="preserve">| BR-016 | Loan restructuring | Partial | Manual adjustment path; automated rules planned v1.9 |</w:t>
+      </w:r>
+    </w:p>
+    <w:p>
+      <w:pPr>
+        <w:spacing w:after="120"/>
+      </w:pPr>
+      <w:r>
+        <w:rPr>
+          <w:sz w:val="22"/>
+          <w:szCs w:val="22"/>
+        </w:rPr>
+        <w:t xml:space="preserve">| BR-017 | Super Admin may approve/disburse loans they created | Complete | Maker-checker exception for Super Admin only (v1.8.0) |</w:t>
       </w:r>
     </w:p>
     <w:p>
@@ -851,6 +863,42 @@
     </w:p>
     <w:p>
       <w:pPr>
+        <w:spacing w:after="120"/>
+      </w:pPr>
+      <w:r>
+        <w:rPr>
+          <w:sz w:val="22"/>
+          <w:szCs w:val="22"/>
+        </w:rPr>
+        <w:t xml:space="preserve">| BR-064 | Approver assign borrower to group | Complete | Non-silent Assign Group (v1.8.0 Phase 11) |</w:t>
+      </w:r>
+    </w:p>
+    <w:p>
+      <w:pPr>
+        <w:spacing w:after="120"/>
+      </w:pPr>
+      <w:r>
+        <w:rPr>
+          <w:sz w:val="22"/>
+          <w:szCs w:val="22"/>
+        </w:rPr>
+        <w:t xml:space="preserve">| BR-065 | Operational group/collector reassignment | Complete | /ops/reassignment |</w:t>
+      </w:r>
+    </w:p>
+    <w:p>
+      <w:pPr>
+        <w:spacing w:after="120"/>
+      </w:pPr>
+      <w:r>
+        <w:rPr>
+          <w:sz w:val="22"/>
+          <w:szCs w:val="22"/>
+        </w:rPr>
+        <w:t xml:space="preserve">| BR-066 | Payment day change with schedule recalculation | Complete | Enterprise approve + recalc |</w:t>
+      </w:r>
+    </w:p>
+    <w:p>
+      <w:pPr>
         <w:pStyle w:val="Heading2"/>
         <w:spacing w:after="100" w:before="200"/>
       </w:pPr>
@@ -1050,7 +1098,19 @@
           <w:sz w:val="22"/>
           <w:szCs w:val="22"/>
         </w:rPr>
-        <w:t xml:space="preserve">| BR-083 | Portfolio breakdown | Complete | District/community/group |</w:t>
+        <w:t xml:space="preserve">| BR-083 | Portfolio breakdown | Complete | Region / MMDA / sub-district / electoral area / community |</w:t>
+      </w:r>
+    </w:p>
+    <w:p>
+      <w:pPr>
+        <w:spacing w:after="120"/>
+      </w:pPr>
+      <w:r>
+        <w:rPr>
+          <w:sz w:val="22"/>
+          <w:szCs w:val="22"/>
+        </w:rPr>
+        <w:t xml:space="preserve">| BR-088 | Ghana administrative location master | Complete | Hierarchy v2; 16 regions; 261 MMDAs; STMA deep coverage; suggestion workflow; offline cache |</w:t>
       </w:r>
     </w:p>
     <w:p>
@@ -1218,7 +1278,7 @@
           <w:sz w:val="22"/>
           <w:szCs w:val="22"/>
         </w:rPr>
-        <w:t xml:space="preserve">| BR-096 | Borrower SMS reminders | Planned | v2.5 engagement |</w:t>
+        <w:t xml:space="preserve">| BR-096 | Borrower lifecycle SMS/email | Complete | Registration through delinquency ladder (v1.8.0 Phase 11) |</w:t>
       </w:r>
     </w:p>
     <w:p>
@@ -1319,6 +1379,18 @@
     </w:p>
     <w:p>
       <w:pPr>
+        <w:spacing w:after="120"/>
+      </w:pPr>
+      <w:r>
+        <w:rPr>
+          <w:sz w:val="22"/>
+          <w:szCs w:val="22"/>
+        </w:rPr>
+        <w:t xml:space="preserve">| BR-105 | Operations reassignment console | Complete | Group, collector, payment day |</w:t>
+      </w:r>
+    </w:p>
+    <w:p>
+      <w:pPr>
         <w:pStyle w:val="Heading2"/>
         <w:spacing w:after="100" w:before="200"/>
       </w:pPr>
@@ -1639,6 +1711,66 @@
           <w:szCs w:val="22"/>
         </w:rPr>
         <w:t xml:space="preserve">| BR-134 | OpenAPI specification | Planned | v1.8 |</w:t>
+      </w:r>
+    </w:p>
+    <w:p>
+      <w:pPr>
+        <w:spacing w:after="120"/>
+      </w:pPr>
+      <w:r>
+        <w:rPr>
+          <w:sz w:val="22"/>
+          <w:szCs w:val="22"/>
+        </w:rPr>
+        <w:t xml:space="preserve">| BR-135 | Guarantor may cover three active borrowers | Complete | Duplicate only for same borrower |</w:t>
+      </w:r>
+    </w:p>
+    <w:p>
+      <w:pPr>
+        <w:spacing w:after="120"/>
+      </w:pPr>
+      <w:r>
+        <w:rPr>
+          <w:sz w:val="22"/>
+          <w:szCs w:val="22"/>
+        </w:rPr>
+        <w:t xml:space="preserve">| BR-136 | Official readable document IDs | Complete | BRW / LN / COL formats |</w:t>
+      </w:r>
+    </w:p>
+    <w:p>
+      <w:pPr>
+        <w:spacing w:after="120"/>
+      </w:pPr>
+      <w:r>
+        <w:rPr>
+          <w:sz w:val="22"/>
+          <w:szCs w:val="22"/>
+        </w:rPr>
+        <w:t xml:space="preserve">| BR-137 | Collector borrower update requests | Complete | Officer / Super Admin approval |</w:t>
+      </w:r>
+    </w:p>
+    <w:p>
+      <w:pPr>
+        <w:spacing w:after="120"/>
+      </w:pPr>
+      <w:r>
+        <w:rPr>
+          <w:sz w:val="22"/>
+          <w:szCs w:val="22"/>
+        </w:rPr>
+        <w:t xml:space="preserve">| BR-138 | Group collection GPS with exception audit | Complete | Confirmation + reason required |</w:t>
+      </w:r>
+    </w:p>
+    <w:p>
+      <w:pPr>
+        <w:spacing w:after="120"/>
+      </w:pPr>
+      <w:r>
+        <w:rPr>
+          <w:sz w:val="22"/>
+          <w:szCs w:val="22"/>
+        </w:rPr>
+        <w:t xml:space="preserve">| BR-139 | Mandatory borrower SMS | Complete | Outage flag only |</w:t>
       </w:r>
     </w:p>
     <w:p>

</xml_diff>